<commit_message>
chore(docs): update Project D1 Submission document
</commit_message>
<xml_diff>
--- a/docs/Project D1 Submission.docx
+++ b/docs/Project D1 Submission.docx
@@ -1557,7 +1557,7 @@
               <w:rPr>
                 <w:rtl w:val="0"/>
               </w:rPr>
-              <w:t xml:space="preserve">Only an account with valid credentials may receive a 15-minute access token and a revocable 7 day refresh token; logout shall revoke the current refresh token.</w:t>
+              <w:t xml:space="preserve">Only an account with valid credentials shall receive a 15-minute access token and a revocable seven-day refresh session; logout shall revoke the current refresh session.</w:t>
             </w:r>
           </w:p>
         </w:tc>
@@ -2221,7 +2221,7 @@
               <w:rPr>
                 <w:rtl w:val="0"/>
               </w:rPr>
-              <w:t xml:space="preserve">The system should handle all authorization verification for user-initiated actions on the backend. Display values should never be used for authorization</w:t>
+              <w:t xml:space="preserve">The service shall perform all authorization verification for user-initiated actions on the server; a display value, client-supplied role, or request header shall never be an authorization input.</w:t>
             </w:r>
           </w:p>
         </w:tc>
@@ -2724,7 +2724,7 @@
               <w:rPr>
                 <w:rtl w:val="0"/>
               </w:rPr>
-              <w:t xml:space="preserve">A student may read and update only their display name, faculty, avatar reference, and contact preference. Administrators can edit a user’s account status.</w:t>
+              <w:t xml:space="preserve">A student shall be able to read and update only their own display name, faculty, avatar reference, and contact preference; only an administrator shall be able to change a user's account status.</w:t>
             </w:r>
           </w:p>
         </w:tc>
@@ -3046,7 +3046,7 @@
               <w:rPr>
                 <w:rtl w:val="0"/>
               </w:rPr>
-              <w:t xml:space="preserve">Any user who is not an administrator will not be allowed to perform actions on other users.</w:t>
+              <w:t xml:space="preserve">A user who is not an administrator shall not be permitted to perform any action on another user's account.</w:t>
             </w:r>
           </w:p>
         </w:tc>
@@ -3207,7 +3207,7 @@
               <w:rPr>
                 <w:rtl w:val="0"/>
               </w:rPr>
-              <w:t xml:space="preserve">The initial admins can be seeded, and an administrator may appoint other admins. There must be at least one admin in the system.</w:t>
+              <w:t xml:space="preserve">The service shall support seeded initial administrators, and an administrator shall be able to appoint further administrators; at least one administrator shall exist in the system at all times.</w:t>
             </w:r>
           </w:p>
         </w:tc>
@@ -3368,7 +3368,7 @@
               <w:rPr>
                 <w:rtl w:val="0"/>
               </w:rPr>
-              <w:t xml:space="preserve">Appointed admins cannot downgrade other admins. Downgrading permissions can only be done by the seeded admins.</w:t>
+              <w:t xml:space="preserve">An appointed administrator shall not be permitted to downgrade another administrator; only a seeded administrator shall be permitted to downgrade administrator permissions.</w:t>
             </w:r>
           </w:p>
         </w:tc>
@@ -4193,7 +4193,7 @@
               <w:rPr>
                 <w:rtl w:val="0"/>
               </w:rPr>
-              <w:t xml:space="preserve">User service will expose the available permissions of a user to any service that requires administrator permissions in order to carry out an action.</w:t>
+              <w:t xml:space="preserve">The service shall expose a user's effective permissions to any service that requires administrator authorization before carrying out an action.</w:t>
             </w:r>
           </w:p>
         </w:tc>
@@ -4416,7 +4416,7 @@
               <w:rPr>
                 <w:rtl w:val="0"/>
               </w:rPr>
-              <w:t xml:space="preserve">l1</w:t>
+              <w:t xml:space="preserve">I1</w:t>
             </w:r>
           </w:p>
         </w:tc>
@@ -6236,7 +6236,7 @@
               <w:rPr>
                 <w:rtl w:val="0"/>
               </w:rPr>
-              <w:t xml:space="preserve">Any deletions on suppliers are held until all existing errands are completed. Any new errands should not be able to select a supplier to be deleted.</w:t>
+              <w:t xml:space="preserve">A supplier marked for deletion shall not be selectable for a new errand, and its record shall be retained until every errand referencing it has reached a terminal state, after which it may be removed.</w:t>
             </w:r>
           </w:p>
         </w:tc>
@@ -6298,7 +6298,7 @@
               <w:rPr>
                 <w:rtl w:val="0"/>
               </w:rPr>
-              <w:t xml:space="preserve">I1</w:t>
+              <w:t xml:space="preserve">I2</w:t>
             </w:r>
           </w:p>
         </w:tc>
@@ -6578,7 +6578,7 @@
               <w:rPr>
                 <w:rtl w:val="0"/>
               </w:rPr>
-              <w:t xml:space="preserve">The service shall list active suppliers with search and filters suitable for requester selection.</w:t>
+              <w:t xml:space="preserve">The service shall list active suppliers using the search, filter, and ordering rules defined in its refinements.</w:t>
             </w:r>
           </w:p>
         </w:tc>
@@ -7242,7 +7242,7 @@
               <w:rPr>
                 <w:rtl w:val="0"/>
               </w:rPr>
-              <w:t xml:space="preserve">The service shall initialize a rich, repeatable data set and expose exact lookup by identifier.</w:t>
+              <w:t xml:space="preserve">The service shall initialise a repeatable catalogue of the size defined in its refinement and expose exact lookup by identifier.</w:t>
             </w:r>
           </w:p>
         </w:tc>
@@ -8231,7 +8231,7 @@
                 <w:bCs w:val="1"/>
                 <w:rtl w:val="0"/>
               </w:rPr>
-              <w:t xml:space="preserve">The Order Service shall create an errand only after its reward credits are reserved.</w:t>
+              <w:t xml:space="preserve">The Order Service shall create an errand in PENDING_CREDIT, request its reward reservation, and open the errand only after the reservation succeeds.</w:t>
             </w:r>
           </w:p>
         </w:tc>
@@ -8402,7 +8402,7 @@
               <w:rPr>
                 <w:rtl w:val="0"/>
               </w:rPr>
-              <w:t xml:space="preserve">If the reservation fails (insufficient balance, or the credit service is unavailable), the system shall reject the errand creation request and return a reason to the requester. No errand record shall be persisted.</w:t>
+              <w:t xml:space="preserve">If the reservation fails because of insufficient balance or an unavailable Credit Service, the service shall move the errand to REJECTED and return a reason to the requester; the errand shall never become OPEN and no reward shall remain reserved. A REJECTED errand shall be visible only to its requester.</w:t>
             </w:r>
           </w:p>
         </w:tc>
@@ -8563,7 +8563,7 @@
               <w:rPr>
                 <w:rtl w:val="0"/>
               </w:rPr>
-              <w:t xml:space="preserve">If the reservation fails because of insufficient balance, system shall reject and indicate required amount</w:t>
+              <w:t xml:space="preserve">If the reservation fails because of insufficient balance, the service shall reject the errand and return both the required amount and the requester's current available balance.</w:t>
             </w:r>
           </w:p>
           <w:p>
@@ -8735,7 +8735,7 @@
               <w:rPr>
                 <w:rtl w:val="0"/>
               </w:rPr>
-              <w:t xml:space="preserve">If the reservation fails because of service unavailable, system shall reject and retry</w:t>
+              <w:t xml:space="preserve">If the reservation fails because the Credit Service is unavailable or returns CreditReservationRejected, the service shall reject the errand and return a result that the interface may retry using the same idempotency key.</w:t>
             </w:r>
           </w:p>
         </w:tc>
@@ -8958,7 +8958,7 @@
               <w:rPr>
                 <w:rtl w:val="0"/>
               </w:rPr>
-              <w:t xml:space="preserve">l2</w:t>
+              <w:t xml:space="preserve">I2</w:t>
             </w:r>
           </w:p>
         </w:tc>
@@ -9119,7 +9119,7 @@
               <w:rPr>
                 <w:rtl w:val="0"/>
               </w:rPr>
-              <w:t xml:space="preserve">l2</w:t>
+              <w:t xml:space="preserve">I2</w:t>
             </w:r>
           </w:p>
         </w:tc>
@@ -12216,7 +12216,7 @@
               <w:rPr>
                 <w:rtl w:val="0"/>
               </w:rPr>
-              <w:t xml:space="preserve">The requester may cancel OPEN or ACCEPTED before pickup, and an assigned courier may withdraw from ACCEPTED before pickup; withdrawal reopens the order if its deadline has not passed, while cancellation requests a credit release.</w:t>
+              <w:t xml:space="preserve">The requester may cancel an errand in OPEN or ACCEPTED before pickup and an assigned courier may withdraw from ACCEPTED before pickup; cancellation shall move the errand to CANCEL_PENDING_CREDIT and request a credit release, while withdrawal shall return the errand to OPEN if its acceptance deadline has not passed.</w:t>
             </w:r>
           </w:p>
         </w:tc>
@@ -13767,7 +13767,7 @@
               <w:rPr>
                 <w:rtl w:val="0"/>
               </w:rPr>
-              <w:t xml:space="preserve">l3</w:t>
+              <w:t xml:space="preserve">I3</w:t>
             </w:r>
           </w:p>
         </w:tc>
@@ -17371,7 +17371,15 @@
                 <w:bCs w:val="1"/>
                 <w:rtl w:val="0"/>
               </w:rPr>
-              <w:t xml:space="preserve">I2-l3</w:t>
+              <w:t xml:space="preserve">I</w:t>
+            </w:r>
+            <w:r>
+              <w:rPr>
+                <w:b w:val="1"/>
+                <w:bCs w:val="1"/>
+                <w:rtl w:val="0"/>
+              </w:rPr>
+              <w:t xml:space="preserve">2-I3</w:t>
             </w:r>
           </w:p>
         </w:tc>
@@ -17532,7 +17540,7 @@
               <w:rPr>
                 <w:rtl w:val="0"/>
               </w:rPr>
-              <w:t xml:space="preserve">l2-</w:t>
+              <w:t xml:space="preserve">I2-</w:t>
             </w:r>
             <w:r>
               <w:rPr>
@@ -17699,7 +17707,7 @@
               <w:rPr>
                 <w:rtl w:val="0"/>
               </w:rPr>
-              <w:t xml:space="preserve">l2-I3</w:t>
+              <w:t xml:space="preserve">I2</w:t>
             </w:r>
             <w:r>
               <w:rPr>
@@ -17865,7 +17873,13 @@
               <w:rPr>
                 <w:rtl w:val="0"/>
               </w:rPr>
-              <w:t xml:space="preserve">I3</w:t>
+              <w:t xml:space="preserve">I</w:t>
+            </w:r>
+            <w:r>
+              <w:rPr>
+                <w:rtl w:val="0"/>
+              </w:rPr>
+              <w:t xml:space="preserve">3</w:t>
             </w:r>
           </w:p>
         </w:tc>
@@ -18411,7 +18425,12 @@
                 <w:bCs w:val="1"/>
                 <w:rtl w:val="0"/>
               </w:rPr>
-              <w:t xml:space="preserve">The platform shall provide meaningful asynchronous coordination for user activation and the order-credit lifecycle.</w:t>
+              <w:t xml:space="preserve">The platform shall coordinate user activation and the order-credit lifecycle asynchronously through versioned domain events.</w:t>
+            </w:r>
+            <w:r>
+              <w:rPr>
+                <w:rtl w:val="0"/>
+              </w:rPr>
             </w:r>
           </w:p>
         </w:tc>
@@ -18743,7 +18762,12 @@
               <w:rPr>
                 <w:rtl w:val="0"/>
               </w:rPr>
-              <w:t xml:space="preserve">The event set shall cover UserActivated, CreditReservationRequested, CreditReserved, CreditReservationRejected, OrderCompletionRequested, CreditsTransferred, CreditReleaseRequested, CreditReleased, and OrderStatusChanged.</w:t>
+              <w:t xml:space="preserve">The event set shall cover UserActivated, UserSuspended, UserReactivated, CreditReservationRequested, CreditReserved, CreditReservationRejected, OrderCompletionRequested, CreditsTransferred, CreditReleaseRequested, CreditReleased, and OrderStatusChanged.</w:t>
+            </w:r>
+            <w:r>
+              <w:rPr>
+                <w:rtl w:val="0"/>
+              </w:rPr>
             </w:r>
           </w:p>
         </w:tc>
@@ -23299,7 +23323,12 @@
               <w:rPr>
                 <w:rtl w:val="0"/>
               </w:rPr>
-              <w:t xml:space="preserve">The interface shall make current state, state history, balances, and related credit entries easy to verify.</w:t>
+              <w:t xml:space="preserve">The interface shall present current state, state history, balances, and related credit entries so that a user can confirm each without leaving the page.</w:t>
+            </w:r>
+            <w:r>
+              <w:rPr>
+                <w:rtl w:val="0"/>
+              </w:rPr>
             </w:r>
           </w:p>
         </w:tc>
@@ -27088,7 +27117,12 @@
                 <w:bCs w:val="1"/>
                 <w:rtl w:val="0"/>
               </w:rPr>
-              <w:t xml:space="preserve">I1-l3</w:t>
+              <w:t xml:space="preserve">I1-I3</w:t>
+            </w:r>
+            <w:r>
+              <w:rPr>
+                <w:rtl w:val="0"/>
+              </w:rPr>
             </w:r>
           </w:p>
         </w:tc>
@@ -27249,13 +27283,12 @@
               <w:rPr>
                 <w:rtl w:val="0"/>
               </w:rPr>
-              <w:t xml:space="preserve">l1-</w:t>
-            </w:r>
-            <w:r>
-              <w:rPr>
-                <w:rtl w:val="0"/>
-              </w:rPr>
-              <w:t xml:space="preserve">I3</w:t>
+              <w:t xml:space="preserve">I1-I3</w:t>
+            </w:r>
+            <w:r>
+              <w:rPr>
+                <w:rtl w:val="0"/>
+              </w:rPr>
             </w:r>
           </w:p>
         </w:tc>
@@ -27354,7 +27387,12 @@
               <w:rPr>
                 <w:rtl w:val="0"/>
               </w:rPr>
-              <w:t xml:space="preserve">Structured logs shall use userId and request correlationId rather than verified email where possible and shall redact credentials and token values in every tested error path.</w:t>
+              <w:t xml:space="preserve">Structured logs shall identify a user by userId and a request by correlationId, and shall never contain a verified email address, credential, or token value in any tested path.</w:t>
+            </w:r>
+            <w:r>
+              <w:rPr>
+                <w:rtl w:val="0"/>
+              </w:rPr>
             </w:r>
           </w:p>
         </w:tc>
@@ -36297,7 +36335,12 @@
                 <w:bCs w:val="1"/>
                 <w:rtl w:val="0"/>
               </w:rPr>
-              <w:t xml:space="preserve">The Credit Service shall complete normal wallet work promptly and recover pending work.</w:t>
+              <w:t xml:space="preserve">The Credit Service shall meet the wallet response targets defined in its refinements and resume pending work after a restart.</w:t>
+            </w:r>
+            <w:r>
+              <w:rPr>
+                <w:rtl w:val="0"/>
+              </w:rPr>
             </w:r>
           </w:p>
         </w:tc>
@@ -37697,7 +37740,15 @@
                 <w:bCs w:val="1"/>
                 <w:rtl w:val="0"/>
               </w:rPr>
-              <w:t xml:space="preserve">I2-l3</w:t>
+              <w:t xml:space="preserve">I</w:t>
+            </w:r>
+            <w:r>
+              <w:rPr>
+                <w:b w:val="1"/>
+                <w:bCs w:val="1"/>
+                <w:rtl w:val="0"/>
+              </w:rPr>
+              <w:t xml:space="preserve">2-I3</w:t>
             </w:r>
           </w:p>
         </w:tc>
@@ -37858,7 +37909,13 @@
               <w:rPr>
                 <w:rtl w:val="0"/>
               </w:rPr>
-              <w:t xml:space="preserve">I2-l3</w:t>
+              <w:t xml:space="preserve">I</w:t>
+            </w:r>
+            <w:r>
+              <w:rPr>
+                <w:rtl w:val="0"/>
+              </w:rPr>
+              <w:t xml:space="preserve">2-I3</w:t>
             </w:r>
           </w:p>
         </w:tc>
@@ -38019,7 +38076,13 @@
               <w:rPr>
                 <w:rtl w:val="0"/>
               </w:rPr>
-              <w:t xml:space="preserve">I2</w:t>
+              <w:t xml:space="preserve">I</w:t>
+            </w:r>
+            <w:r>
+              <w:rPr>
+                <w:rtl w:val="0"/>
+              </w:rPr>
+              <w:t xml:space="preserve">2</w:t>
             </w:r>
           </w:p>
         </w:tc>
@@ -38180,7 +38243,13 @@
               <w:rPr>
                 <w:rtl w:val="0"/>
               </w:rPr>
-              <w:t xml:space="preserve">I3</w:t>
+              <w:t xml:space="preserve">I</w:t>
+            </w:r>
+            <w:r>
+              <w:rPr>
+                <w:rtl w:val="0"/>
+              </w:rPr>
+              <w:t xml:space="preserve">3</w:t>
             </w:r>
           </w:p>
         </w:tc>
@@ -42667,7 +42736,7 @@
                 <w:bCs w:val="1"/>
                 <w:rtl w:val="0"/>
               </w:rPr>
-              <w:t xml:space="preserve">I1-l4</w:t>
+              <w:t xml:space="preserve">I1-I4</w:t>
             </w:r>
           </w:p>
         </w:tc>
@@ -42823,7 +42892,7 @@
               <w:rPr>
                 <w:rtl w:val="0"/>
               </w:rPr>
-              <w:t xml:space="preserve">I1-l4</w:t>
+              <w:t xml:space="preserve">I1-I4</w:t>
             </w:r>
           </w:p>
         </w:tc>
@@ -42974,7 +43043,7 @@
               <w:rPr>
                 <w:rtl w:val="0"/>
               </w:rPr>
-              <w:t xml:space="preserve">I1-l4</w:t>
+              <w:t xml:space="preserve">I1-I4</w:t>
             </w:r>
           </w:p>
         </w:tc>
@@ -43130,7 +43199,7 @@
               <w:rPr>
                 <w:rtl w:val="0"/>
               </w:rPr>
-              <w:t xml:space="preserve">I1-l4</w:t>
+              <w:t xml:space="preserve">I1-I4</w:t>
             </w:r>
           </w:p>
         </w:tc>
@@ -43236,7 +43305,7 @@
                 <w:bCs w:val="1"/>
                 <w:rtl w:val="0"/>
               </w:rPr>
-              <w:t xml:space="preserve">The Web UI shall load and acknowledge interaction promptly.</w:t>
+              <w:t xml:space="preserve">The Web UI shall meet the load and interaction-feedback targets defined in its refinements.</w:t>
             </w:r>
           </w:p>
         </w:tc>
@@ -53512,12 +53581,12 @@
           <wp:inline distB="114300" distT="114300" distL="114300" distR="114300">
             <wp:extent cx="4368800" cy="2730500"/>
             <wp:effectExtent b="0" l="0" r="0" t="0"/>
-            <wp:docPr descr="Title: Requester desktop mockup showing the dashboard, wallet balance, open requests, and structured request creation form. - Description: Requester desktop mockup showing the dashboard, wallet balance, open requests, and structured request creation form." id="7" name="image4.png"/>
+            <wp:docPr descr="Title: Requester desktop mockup showing the dashboard, wallet balance, open requests, and structured request creation form. - Description: Requester desktop mockup showing the dashboard, wallet balance, open requests, and structured request creation form." id="7" name="image3.png"/>
             <a:graphic>
               <a:graphicData uri="http://schemas.openxmlformats.org/drawingml/2006/picture">
                 <pic:pic>
                   <pic:nvPicPr>
-                    <pic:cNvPr descr="Title: Requester desktop mockup showing the dashboard, wallet balance, open requests, and structured request creation form. - Description: Requester desktop mockup showing the dashboard, wallet balance, open requests, and structured request creation form." id="0" name="image4.png"/>
+                    <pic:cNvPr descr="Title: Requester desktop mockup showing the dashboard, wallet balance, open requests, and structured request creation form. - Description: Requester desktop mockup showing the dashboard, wallet balance, open requests, and structured request creation form." id="0" name="image3.png"/>
                     <pic:cNvPicPr preferRelativeResize="0"/>
                   </pic:nvPicPr>
                   <pic:blipFill>
@@ -53609,12 +53678,12 @@
           <wp:inline distB="114300" distT="114300" distL="114300" distR="114300">
             <wp:extent cx="4368800" cy="2730500"/>
             <wp:effectExtent b="0" l="0" r="0" t="0"/>
-            <wp:docPr descr="Title: Courier desktop mockup showing searchable open errands with pickup location, reward, expiry, and accept actions. - Description: Courier desktop mockup showing searchable open errands with pickup location, reward, expiry, and accept actions." id="8" name="image2.png"/>
+            <wp:docPr descr="Title: Courier desktop mockup showing searchable open errands with pickup location, reward, expiry, and accept actions. - Description: Courier desktop mockup showing searchable open errands with pickup location, reward, expiry, and accept actions." id="8" name="image4.png"/>
             <a:graphic>
               <a:graphicData uri="http://schemas.openxmlformats.org/drawingml/2006/picture">
                 <pic:pic>
                   <pic:nvPicPr>
-                    <pic:cNvPr descr="Title: Courier desktop mockup showing searchable open errands with pickup location, reward, expiry, and accept actions. - Description: Courier desktop mockup showing searchable open errands with pickup location, reward, expiry, and accept actions." id="0" name="image2.png"/>
+                    <pic:cNvPr descr="Title: Courier desktop mockup showing searchable open errands with pickup location, reward, expiry, and accept actions. - Description: Courier desktop mockup showing searchable open errands with pickup location, reward, expiry, and accept actions." id="0" name="image4.png"/>
                     <pic:cNvPicPr preferRelativeResize="0"/>
                   </pic:nvPicPr>
                   <pic:blipFill>
@@ -53810,12 +53879,12 @@
                 <wp:inline distB="114300" distT="114300" distL="114300" distR="114300">
                   <wp:extent cx="2189535" cy="4592457"/>
                   <wp:effectExtent b="0" l="0" r="0" t="0"/>
-                  <wp:docPr id="1" name="image6.png"/>
+                  <wp:docPr id="1" name="image2.png"/>
                   <a:graphic>
                     <a:graphicData uri="http://schemas.openxmlformats.org/drawingml/2006/picture">
                       <pic:pic>
                         <pic:nvPicPr>
-                          <pic:cNvPr id="0" name="image6.png"/>
+                          <pic:cNvPr id="0" name="image2.png"/>
                           <pic:cNvPicPr preferRelativeResize="0"/>
                         </pic:nvPicPr>
                         <pic:blipFill>
@@ -53987,12 +54056,12 @@
                 <wp:inline distB="114300" distT="114300" distL="114300" distR="114300">
                   <wp:extent cx="2319276" cy="4875212"/>
                   <wp:effectExtent b="0" l="0" r="0" t="0"/>
-                  <wp:docPr id="2" name="image7.png"/>
+                  <wp:docPr id="2" name="image5.png"/>
                   <a:graphic>
                     <a:graphicData uri="http://schemas.openxmlformats.org/drawingml/2006/picture">
                       <pic:pic>
                         <pic:nvPicPr>
-                          <pic:cNvPr id="0" name="image7.png"/>
+                          <pic:cNvPr id="0" name="image5.png"/>
                           <pic:cNvPicPr preferRelativeResize="0"/>
                         </pic:nvPicPr>
                         <pic:blipFill>
@@ -54049,12 +54118,12 @@
                 <wp:inline distB="114300" distT="114300" distL="114300" distR="114300">
                   <wp:extent cx="2165344" cy="4567238"/>
                   <wp:effectExtent b="0" l="0" r="0" t="0"/>
-                  <wp:docPr id="3" name="image8.png"/>
+                  <wp:docPr id="3" name="image7.png"/>
                   <a:graphic>
                     <a:graphicData uri="http://schemas.openxmlformats.org/drawingml/2006/picture">
                       <pic:pic>
                         <pic:nvPicPr>
-                          <pic:cNvPr id="0" name="image8.png"/>
+                          <pic:cNvPr id="0" name="image7.png"/>
                           <pic:cNvPicPr preferRelativeResize="0"/>
                         </pic:nvPicPr>
                         <pic:blipFill>
@@ -54365,12 +54434,12 @@
                 <wp:inline distB="114300" distT="114300" distL="114300" distR="114300">
                   <wp:extent cx="2155611" cy="4570265"/>
                   <wp:effectExtent b="0" l="0" r="0" t="0"/>
-                  <wp:docPr id="9" name="image5.png"/>
+                  <wp:docPr id="9" name="image8.png"/>
                   <a:graphic>
                     <a:graphicData uri="http://schemas.openxmlformats.org/drawingml/2006/picture">
                       <pic:pic>
                         <pic:nvPicPr>
-                          <pic:cNvPr id="0" name="image5.png"/>
+                          <pic:cNvPr id="0" name="image8.png"/>
                           <pic:cNvPicPr preferRelativeResize="0"/>
                         </pic:nvPicPr>
                         <pic:blipFill>
@@ -54497,12 +54566,12 @@
                 <wp:inline distB="114300" distT="114300" distL="114300" distR="114300">
                   <wp:extent cx="2005329" cy="4252913"/>
                   <wp:effectExtent b="0" l="0" r="0" t="0"/>
-                  <wp:docPr id="6" name="image3.png"/>
+                  <wp:docPr id="6" name="image6.png"/>
                   <a:graphic>
                     <a:graphicData uri="http://schemas.openxmlformats.org/drawingml/2006/picture">
                       <pic:pic>
                         <pic:nvPicPr>
-                          <pic:cNvPr id="0" name="image3.png"/>
+                          <pic:cNvPr id="0" name="image6.png"/>
                           <pic:cNvPicPr preferRelativeResize="0"/>
                         </pic:nvPicPr>
                         <pic:blipFill>

</xml_diff>